<commit_message>
docs: remove MANUAL DIDATICO + atualiza referências nos manuais restantes
</commit_message>
<xml_diff>
--- a/docs/TECHCHALLENGE_FASE3_PROJETO_COMPLETO.docx
+++ b/docs/TECHCHALLENGE_FASE3_PROJETO_COMPLETO.docx
@@ -9145,8 +9145,6 @@
         <w:br/>
         <w:t>│   ├── RELATORIO_TECNICO_PARA_EQUIPE.md      Relatório técnico principal</w:t>
         <w:br/>
-        <w:t>│   ├── MANUAL_DIDATICO_PARA_EQUIPE.md       Manual didático (pra leigos)</w:t>
-        <w:br/>
         <w:t>│   ├── MANUAL_UI.md                          Manual de uso da UI</w:t>
         <w:br/>
         <w:t>│   ├── GUIA_DATASETS.md                     Guia dos datasets</w:t>
@@ -9156,8 +9154,6 @@
         <w:t>│   ├── index.html                           HTML do Space HF</w:t>
         <w:br/>
         <w:t>│   ├── RELATORIO_TECNICO_PARA_EQUIPE.docx   Versão DOCX</w:t>
-        <w:br/>
-        <w:t>│   ├── MANUAL_DIDATICO_PARA_EQUIPE.docx</w:t>
         <w:br/>
         <w:t>│   ├── MANUAL_UI.docx</w:t>
         <w:br/>
@@ -14072,27 +14068,6 @@
           <w:sz w:val="20"/>
         </w:rPr>
         <w:t>docs/GUIA_DATASETS.md</w:t>
-      </w:r>
-    </w:p>
-    <w:p>
-      <w:pPr>
-        <w:pStyle w:val="ListBullet"/>
-      </w:pPr>
-      <w:r>
-        <w:rPr>
-          <w:b/>
-        </w:rPr>
-        <w:t>Manual didático</w:t>
-      </w:r>
-      <w:r>
-        <w:t xml:space="preserve">: </w:t>
-      </w:r>
-      <w:r>
-        <w:rPr>
-          <w:rFonts w:ascii="Consolas" w:hAnsi="Consolas"/>
-          <w:sz w:val="20"/>
-        </w:rPr>
-        <w:t>docs/MANUAL_DIDATICO_PARA_EQUIPE.md</w:t>
       </w:r>
     </w:p>
     <w:p>

</xml_diff>

<commit_message>
docs: remover 'Michelle' da coluna 'Quem' nos cronogramas
Substituído por '—' (em branco) em todos os cronogramas pendentes:

RELATORIO_TECNICO_PARA_EQUIPE.md (seção 9.1):
- Testar tradutor / Gravar vídeo / Demo / DOCX / Submeter: Michelle -> —
- 5 linhas atualizadas

TECHCHALLENGE_FASE3_PROJETO_COMPLETO.md (seção 9.1):
- Testar UI / Gravar tela / Demo / DOCX / Submeter: Michelle -> —
- 5 linhas atualizadas

Sem hierarquia de responsável — equipe Flamers Team decide internamente.
DOCX regenerados.
</commit_message>
<xml_diff>
--- a/docs/TECHCHALLENGE_FASE3_PROJETO_COMPLETO.docx
+++ b/docs/TECHCHALLENGE_FASE3_PROJETO_COMPLETO.docx
@@ -13439,7 +13439,7 @@
               <w:rPr>
                 <w:sz w:val="18"/>
               </w:rPr>
-              <w:t>Michelle</w:t>
+              <w:t>—</w:t>
             </w:r>
           </w:p>
         </w:tc>
@@ -13496,7 +13496,7 @@
               <w:rPr>
                 <w:sz w:val="18"/>
               </w:rPr>
-              <w:t>Michelle</w:t>
+              <w:t>—</w:t>
             </w:r>
           </w:p>
         </w:tc>
@@ -13553,7 +13553,7 @@
               <w:rPr>
                 <w:sz w:val="18"/>
               </w:rPr>
-              <w:t>Michelle</w:t>
+              <w:t>—</w:t>
             </w:r>
           </w:p>
         </w:tc>
@@ -13610,7 +13610,7 @@
               <w:rPr>
                 <w:sz w:val="18"/>
               </w:rPr>
-              <w:t>Michelle</w:t>
+              <w:t>—</w:t>
             </w:r>
           </w:p>
         </w:tc>
@@ -13667,7 +13667,7 @@
               <w:rPr>
                 <w:sz w:val="18"/>
               </w:rPr>
-              <w:t>Michelle</w:t>
+              <w:t>—</w:t>
             </w:r>
           </w:p>
         </w:tc>

</xml_diff>